<commit_message>
Weather levels from US sources (FHWA), not the Philippine and typhoon studies
Light rain 3% and heavy rain 7.5% (FHWA 2006, Hranac et al., p.5-17); wet
arterial 10% and extreme 25% (FHWA Road Weather Management: arterial speeds
drop 10-25% on wet pavement). The 25% value was attributed to Ji et al. 2024,
whose own table shows an 8% drop. Modelling weather as one synthetic slowdown
for every vehicle follows Wang & Sun 2023 (bus MARL), Da et al. 2023/2024 and
Turnau et al. 2025. Evaluation cells: B_light, B_heavy, B_wet, B_extreme.
Training range (0-25%) and the extreme cell are unchanged. The changed Stage B
baselines are re-run by scripts/queue_2026-10-06_weather.sh. Breakdown no longer
cites Daganzo 2009, which does not describe removing a bus.

Co-Authored-By: Claude Opus 5.5 <noreply@anthropic.com>
</commit_message>
<xml_diff>
--- a/docs/msa3_member_guides/3_Lopez_Weather/B3_Guide_Weather_Lopez.docx
+++ b/docs/msa3_member_guides/3_Lopez_Weather/B3_Guide_Weather_Lopez.docx
@@ -98,7 +98,7 @@
           <w:color w:val="1F2933"/>
           <w:sz w:val="22"/>
         </w:rPr>
-        <w:t xml:space="preserve"> for the whole run: one number per run. That is the weather design we locked on 18 September (the August manuscript still shows an older random “η” version; ignore it).</w:t>
+        <w:t xml:space="preserve"> for the whole run: one number per run. This is how RL studies model weather: Wang &amp; Sun 2023 (a bus MARL paper) scale every bus's cruising speed once per run, and Da et al. 2023/2024 and Turnau et al. 2025 (a MARL paper) apply one set of rain settings to every vehicle. The sizes come from the US Federal Highway Administration (FHWA). The August manuscript still shows an older random “η” version; ignore it.</w:t>
       </w:r>
     </w:p>
     <w:p>
@@ -1163,7 +1163,7 @@
           <w:color w:val="1F2933"/>
           <w:sz w:val="22"/>
         </w:rPr>
-        <w:t>s = 0 (baseline), 0.053 (light rain), 0.063 (moderate), 0.074 (heavy), 0.25 (extreme rainstorm).</w:t>
+        <w:t>s = 0 (baseline), 0.03 (light rain), 0.075 (heavy rain), 0.10 (wet arterial), 0.25 (extreme, wet arterial).</w:t>
       </w:r>
     </w:p>
     <w:p>
@@ -1219,7 +1219,7 @@
           <w:color w:val="2E4B73"/>
           <w:sz w:val="19"/>
         </w:rPr>
-        <w:t>w053</w:t>
+        <w:t>w030</w:t>
       </w:r>
       <w:r>
         <w:rPr>
@@ -1239,7 +1239,7 @@
           <w:color w:val="2E4B73"/>
           <w:sz w:val="19"/>
         </w:rPr>
-        <w:t>w063</w:t>
+        <w:t>w075</w:t>
       </w:r>
       <w:r>
         <w:rPr>
@@ -1259,7 +1259,7 @@
           <w:color w:val="2E4B73"/>
           <w:sz w:val="19"/>
         </w:rPr>
-        <w:t>w074</w:t>
+        <w:t>w100</w:t>
       </w:r>
       <w:r>
         <w:rPr>
@@ -1488,7 +1488,7 @@
           <w:color w:val="1F2933"/>
           <w:sz w:val="22"/>
         </w:rPr>
-        <w:t xml:space="preserve">Same check at s = 0.074: theory 73 s, measured about </w:t>
+        <w:t xml:space="preserve">Same check at s = 0.075: driving-only 74 s, measured about </w:t>
       </w:r>
       <w:r>
         <w:rPr>
@@ -1498,7 +1498,7 @@
           <w:color w:val="1F2933"/>
           <w:sz w:val="22"/>
         </w:rPr>
-        <w:t>76 s</w:t>
+        <w:t>80 s</w:t>
       </w:r>
       <w:r>
         <w:rPr>
@@ -1508,7 +1508,27 @@
           <w:color w:val="1F2933"/>
           <w:sz w:val="22"/>
         </w:rPr>
-        <w:t>. Pass: between 70 and 82 s longer.</w:t>
+        <w:t xml:space="preserve">. Pass: between 72 and 86 s longer. At s = 0.10: driving-only 101 s, measured about </w:t>
+      </w:r>
+      <w:r>
+        <w:rPr>
+          <w:rFonts w:ascii="Calibri" w:hAnsi="Calibri" w:cs="Calibri" w:eastAsia="Calibri"/>
+          <w:b/>
+          <w:i w:val="0"/>
+          <w:color w:val="1F2933"/>
+          <w:sz w:val="22"/>
+        </w:rPr>
+        <w:t>108 s</w:t>
+      </w:r>
+      <w:r>
+        <w:rPr>
+          <w:rFonts w:ascii="Calibri" w:hAnsi="Calibri" w:cs="Calibri" w:eastAsia="Calibri"/>
+          <w:b w:val="0"/>
+          <w:i w:val="0"/>
+          <w:color w:val="1F2933"/>
+          <w:sz w:val="22"/>
+        </w:rPr>
+        <w:t>. Pass: between 98 and 116 s.</w:t>
       </w:r>
     </w:p>
     <w:p>
@@ -1756,7 +1776,7 @@
                 <w:color w:val="1F2933"/>
                 <w:sz w:val="18"/>
               </w:rPr>
-              <w:t>w053, w063, w074, w250</w:t>
+              <w:t>w030, w075, w100, w250</w:t>
             </w:r>
           </w:p>
         </w:tc>
@@ -2213,7 +2233,7 @@
           <w:color w:val="1F2933"/>
           <w:sz w:val="22"/>
         </w:rPr>
-        <w:t>Is the jump from 7.4% to 25% a bigger change for CV or for travel time? Why?</w:t>
+        <w:t>Is the jump from 10% to 25% a bigger change for CV or for travel time? Why?</w:t>
       </w:r>
     </w:p>
     <w:p>
@@ -2581,7 +2601,7 @@
                 <w:color w:val="1F2933"/>
                 <w:sz w:val="18"/>
               </w:rPr>
-              <w:t>Mejia &amp; Sigua 2018, TSSP (NLEX)</w:t>
+              <w:t>FHWA 2006 (Hranac et al.), FHWA-HOP-07-073</w:t>
             </w:r>
           </w:p>
         </w:tc>
@@ -2611,7 +2631,7 @@
                 <w:color w:val="1F2933"/>
                 <w:sz w:val="18"/>
               </w:rPr>
-              <w:t>Light / moderate / heavy rain: −5.3 / −6.3 / −7.4% average speed</w:t>
+              <w:t>Light rain: free-flow speed −2 to −3.6%; heavy rain (~1.6 cm/h): −6 to −9% (Baltimore, Twin Cities, Seattle)</w:t>
             </w:r>
           </w:p>
         </w:tc>
@@ -2641,7 +2661,7 @@
                 <w:color w:val="1F2933"/>
                 <w:sz w:val="18"/>
               </w:rPr>
-              <w:t>p.15</w:t>
+              <w:t>p.5-17</w:t>
             </w:r>
           </w:p>
         </w:tc>
@@ -2673,7 +2693,7 @@
                 <w:color w:val="1F2933"/>
                 <w:sz w:val="18"/>
               </w:rPr>
-              <w:t>Ji et al. 2024, IJGI 13:50</w:t>
+              <w:t>FHWA Road Weather Management, “How Do Weather Events Affect Roads?”</w:t>
             </w:r>
           </w:p>
         </w:tc>
@@ -2703,7 +2723,7 @@
                 <w:color w:val="1F2933"/>
                 <w:sz w:val="18"/>
               </w:rPr>
-              <w:t>Typhoon rainstorm: about −25% bus speed</w:t>
+              <w:t>Arterials: speed drops 10–25% on wet pavement</w:t>
             </w:r>
           </w:p>
         </w:tc>
@@ -2733,7 +2753,7 @@
                 <w:color w:val="1F2933"/>
                 <w:sz w:val="18"/>
               </w:rPr>
-              <w:t>p.11</w:t>
+              <w:t>web page</w:t>
             </w:r>
           </w:p>
         </w:tc>
@@ -2765,7 +2785,7 @@
                 <w:color w:val="1F2933"/>
                 <w:sz w:val="18"/>
               </w:rPr>
-              <w:t>Sun et al. 2025, Promet 37(1)</w:t>
+              <w:t>Wang &amp; Sun 2023, IEEE T-ITS 24(4)</w:t>
             </w:r>
           </w:p>
         </w:tc>
@@ -2795,7 +2815,7 @@
                 <w:color w:val="1F2933"/>
                 <w:sz w:val="18"/>
               </w:rPr>
-              <w:t>Rain lengthens dwell, but no usable number (why we leave dwell alone)</w:t>
+              <w:t>Bus MARL: one speed-scaling factor per run, randomised in training</w:t>
             </w:r>
           </w:p>
         </w:tc>
@@ -2825,7 +2845,7 @@
                 <w:color w:val="1F2933"/>
                 <w:sz w:val="18"/>
               </w:rPr>
-              <w:t>pp.6–8</w:t>
+              <w:t>p.9</w:t>
             </w:r>
           </w:p>
         </w:tc>
@@ -2857,7 +2877,7 @@
                 <w:color w:val="1F2933"/>
                 <w:sz w:val="18"/>
               </w:rPr>
-              <w:t>Sargent 2010, Winter Simulation Conf.</w:t>
+              <w:t>Turnau et al. 2025 (arXiv 2507.15174); Da et al. 2023 (IEEE CDC)</w:t>
             </w:r>
           </w:p>
         </w:tc>
@@ -2887,6 +2907,98 @@
                 <w:color w:val="1F2933"/>
                 <w:sz w:val="18"/>
               </w:rPr>
+              <w:t>RL weather = one set of rain settings applied to all vehicles</w:t>
+            </w:r>
+          </w:p>
+        </w:tc>
+        <w:tc>
+          <w:tcPr>
+            <w:tcW w:type="dxa" w:w="3120"/>
+            <w:tcW w:type="dxa" w:w="1500"/>
+            <w:shd w:val="clear" w:color="auto" w:fill="EEF2F8"/>
+            <w:tcMar>
+              <w:top w:type="dxa" w:w="40"/>
+              <w:left w:type="dxa" w:w="90"/>
+              <w:bottom w:type="dxa" w:w="40"/>
+              <w:right w:type="dxa" w:w="90"/>
+            </w:tcMar>
+            <w:vAlign w:val="center"/>
+          </w:tcPr>
+          <w:p>
+            <w:pPr>
+              <w:jc w:val="left"/>
+              <w:spacing w:after="0" w:line="240" w:lineRule="auto"/>
+            </w:pPr>
+            <w:r>
+              <w:rPr>
+                <w:rFonts w:ascii="Calibri" w:hAnsi="Calibri" w:cs="Calibri" w:eastAsia="Calibri"/>
+                <w:b w:val="0"/>
+                <w:i w:val="0"/>
+                <w:color w:val="1F2933"/>
+                <w:sz w:val="18"/>
+              </w:rPr>
+              <w:t>p.8, Table 5; Table I</w:t>
+            </w:r>
+          </w:p>
+        </w:tc>
+      </w:tr>
+      <w:tr>
+        <w:tc>
+          <w:tcPr>
+            <w:tcW w:type="dxa" w:w="3120"/>
+            <w:tcW w:type="dxa" w:w="3000"/>
+            <w:shd w:val="clear" w:color="auto" w:fill="FFFFFF"/>
+            <w:tcMar>
+              <w:top w:type="dxa" w:w="40"/>
+              <w:left w:type="dxa" w:w="90"/>
+              <w:bottom w:type="dxa" w:w="40"/>
+              <w:right w:type="dxa" w:w="90"/>
+            </w:tcMar>
+            <w:vAlign w:val="center"/>
+          </w:tcPr>
+          <w:p>
+            <w:pPr>
+              <w:jc w:val="left"/>
+              <w:spacing w:after="0" w:line="240" w:lineRule="auto"/>
+            </w:pPr>
+            <w:r>
+              <w:rPr>
+                <w:rFonts w:ascii="Calibri" w:hAnsi="Calibri" w:cs="Calibri" w:eastAsia="Calibri"/>
+                <w:b w:val="0"/>
+                <w:i w:val="0"/>
+                <w:color w:val="1F2933"/>
+                <w:sz w:val="18"/>
+              </w:rPr>
+              <w:t>Sargent 2010, Winter Simulation Conf.</w:t>
+            </w:r>
+          </w:p>
+        </w:tc>
+        <w:tc>
+          <w:tcPr>
+            <w:tcW w:type="dxa" w:w="3120"/>
+            <w:tcW w:type="dxa" w:w="4860"/>
+            <w:shd w:val="clear" w:color="auto" w:fill="FFFFFF"/>
+            <w:tcMar>
+              <w:top w:type="dxa" w:w="40"/>
+              <w:left w:type="dxa" w:w="90"/>
+              <w:bottom w:type="dxa" w:w="40"/>
+              <w:right w:type="dxa" w:w="90"/>
+            </w:tcMar>
+            <w:vAlign w:val="center"/>
+          </w:tcPr>
+          <w:p>
+            <w:pPr>
+              <w:jc w:val="left"/>
+              <w:spacing w:after="0" w:line="240" w:lineRule="auto"/>
+            </w:pPr>
+            <w:r>
+              <w:rPr>
+                <w:rFonts w:ascii="Calibri" w:hAnsi="Calibri" w:cs="Calibri" w:eastAsia="Calibri"/>
+                <w:b w:val="0"/>
+                <w:i w:val="0"/>
+                <w:color w:val="1F2933"/>
+                <w:sz w:val="18"/>
+              </w:rPr>
               <w:t>Verification: degenerate and extreme-condition tests, traces</w:t>
             </w:r>
           </w:p>
@@ -2895,7 +3007,7 @@
           <w:tcPr>
             <w:tcW w:type="dxa" w:w="3120"/>
             <w:tcW w:type="dxa" w:w="1500"/>
-            <w:shd w:val="clear" w:color="auto" w:fill="EEF2F8"/>
+            <w:shd w:val="clear" w:color="auto" w:fill="FFFFFF"/>
             <w:tcMar>
               <w:top w:type="dxa" w:w="40"/>
               <w:left w:type="dxa" w:w="90"/>

</xml_diff>